<commit_message>
EHIS-3844 [ Inspection Report updates]
</commit_message>
<xml_diff>
--- a/PHOCS-Docgentemplates/PHOCSInspReportCCFLTemplate.docx
+++ b/PHOCS-Docgentemplates/PHOCSInspReportCCFLTemplate.docx
@@ -2,20 +2,6 @@
 <file path=word/document.xml><?xml version="1.0" encoding="utf-8"?>
 <w:document xmlns:wpc="http://schemas.microsoft.com/office/word/2010/wordprocessingCanvas" xmlns:cx="http://schemas.microsoft.com/office/drawing/2014/chartex" xmlns:cx1="http://schemas.microsoft.com/office/drawing/2015/9/8/chartex" xmlns:cx2="http://schemas.microsoft.com/office/drawing/2015/10/21/chartex" xmlns:cx3="http://schemas.microsoft.com/office/drawing/2016/5/9/chartex" xmlns:cx4="http://schemas.microsoft.com/office/drawing/2016/5/10/chartex" xmlns:cx5="http://schemas.microsoft.com/office/drawing/2016/5/11/chartex" xmlns:cx6="http://schemas.microsoft.com/office/drawing/2016/5/12/chartex" xmlns:cx7="http://schemas.microsoft.com/office/drawing/2016/5/13/chartex" xmlns:cx8="http://schemas.microsoft.com/office/drawing/2016/5/14/chartex" xmlns:mc="http://schemas.openxmlformats.org/markup-compatibility/2006" xmlns:aink="http://schemas.microsoft.com/office/drawing/2016/ink" xmlns:am3d="http://schemas.microsoft.com/office/drawing/2017/model3d" xmlns:o="urn:schemas-microsoft-com:office:office" xmlns:oel="http://schemas.microsoft.com/office/2019/extlst" xmlns:r="http://schemas.openxmlformats.org/officeDocument/2006/relationships" xmlns:m="http://schemas.openxmlformats.org/officeDocument/2006/math" xmlns:v="urn:schemas-microsoft-com:vml" xmlns:wp14="http://schemas.microsoft.com/office/word/2010/wordprocessingDrawing" xmlns:wp="http://schemas.openxmlformats.org/drawingml/2006/wordprocessingDrawing" xmlns:w10="urn:schemas-microsoft-com:office:word" xmlns:w="http://schemas.openxmlformats.org/wordprocessingml/2006/main" xmlns:w14="http://schemas.microsoft.com/office/word/2010/wordml" xmlns:w15="http://schemas.microsoft.com/office/word/2012/wordml" xmlns:w16cei="http://schemas.microsoft.com/office/word/2026/wordml/cei" xmlns:w16cex="http://schemas.microsoft.com/office/word/2018/wordml/cex" xmlns:w16cid="http://schemas.microsoft.com/office/word/2016/wordml/cid" xmlns:w16="http://schemas.microsoft.com/office/word/2018/wordml" xmlns:w16du="http://schemas.microsoft.com/office/word/2023/wordml/word16du" xmlns:w16sdtdh="http://schemas.microsoft.com/office/word/2020/wordml/sdtdatahash" xmlns:w16sdtfl="http://schemas.microsoft.com/office/word/2024/wordml/sdtformatlock" xmlns:w16se="http://schemas.microsoft.com/office/word/2015/wordml/symex" xmlns:wpg="http://schemas.microsoft.com/office/word/2010/wordprocessingGroup" xmlns:wpi="http://schemas.microsoft.com/office/word/2010/wordprocessingInk" xmlns:wne="http://schemas.microsoft.com/office/word/2006/wordml" xmlns:wps="http://schemas.microsoft.com/office/word/2010/wordprocessingShape" mc:Ignorable="w14 w15 w16se w16cid w16 w16cex w16sdtdh w16sdtfl w16du wp14">
   <w:body>
-    <w:p>
-      <w:pPr>
-        <w:spacing w:after="60"/>
-        <w:rPr>
-          <w:rFonts w:ascii="BC Sans" w:eastAsia="BC Sans" w:hAnsi="BC Sans" w:cs="BC Sans"/>
-          <w:b/>
-          <w:bCs/>
-          <w:color w:val="00B0F0"/>
-          <w:sz w:val="24"/>
-          <w:szCs w:val="24"/>
-          <w:lang w:val="en-US"/>
-        </w:rPr>
-      </w:pPr>
-    </w:p>
     <w:tbl>
       <w:tblPr>
         <w:tblpPr w:leftFromText="180" w:rightFromText="180" w:vertAnchor="text" w:tblpX="-5" w:tblpY="1"/>
@@ -33,9 +19,9 @@
         <w:tblLook w:val="0600" w:firstRow="0" w:lastRow="0" w:firstColumn="0" w:lastColumn="0" w:noHBand="1" w:noVBand="1"/>
       </w:tblPr>
       <w:tblGrid>
-        <w:gridCol w:w="3544"/>
-        <w:gridCol w:w="3686"/>
-        <w:gridCol w:w="2126"/>
+        <w:gridCol w:w="3114"/>
+        <w:gridCol w:w="3402"/>
+        <w:gridCol w:w="2840"/>
       </w:tblGrid>
       <w:tr>
         <w:trPr>
@@ -43,7 +29,7 @@
         </w:trPr>
         <w:tc>
           <w:tcPr>
-            <w:tcW w:w="3544" w:type="dxa"/>
+            <w:tcW w:w="3114" w:type="dxa"/>
           </w:tcPr>
           <w:p>
             <w:pPr>
@@ -116,7 +102,7 @@
         </w:tc>
         <w:tc>
           <w:tcPr>
-            <w:tcW w:w="3686" w:type="dxa"/>
+            <w:tcW w:w="3402" w:type="dxa"/>
           </w:tcPr>
           <w:p>
             <w:pPr>
@@ -210,7 +196,7 @@
         </w:tc>
         <w:tc>
           <w:tcPr>
-            <w:tcW w:w="2126" w:type="dxa"/>
+            <w:tcW w:w="2840" w:type="dxa"/>
           </w:tcPr>
           <w:p>
             <w:pPr>
@@ -302,7 +288,7 @@
         </w:trPr>
         <w:tc>
           <w:tcPr>
-            <w:tcW w:w="3544" w:type="dxa"/>
+            <w:tcW w:w="3114" w:type="dxa"/>
           </w:tcPr>
           <w:p>
             <w:pPr>
@@ -374,7 +360,7 @@
         </w:tc>
         <w:tc>
           <w:tcPr>
-            <w:tcW w:w="3686" w:type="dxa"/>
+            <w:tcW w:w="3402" w:type="dxa"/>
           </w:tcPr>
           <w:p>
             <w:pPr>
@@ -479,7 +465,7 @@
         </w:tc>
         <w:tc>
           <w:tcPr>
-            <w:tcW w:w="2126" w:type="dxa"/>
+            <w:tcW w:w="2840" w:type="dxa"/>
           </w:tcPr>
           <w:p>
             <w:pPr>
@@ -564,7 +550,7 @@
         </w:trPr>
         <w:tc>
           <w:tcPr>
-            <w:tcW w:w="3544" w:type="dxa"/>
+            <w:tcW w:w="3114" w:type="dxa"/>
           </w:tcPr>
           <w:p>
             <w:pPr>
@@ -708,7 +694,7 @@
         </w:tc>
         <w:tc>
           <w:tcPr>
-            <w:tcW w:w="3686" w:type="dxa"/>
+            <w:tcW w:w="3402" w:type="dxa"/>
           </w:tcPr>
           <w:p>
             <w:pPr>
@@ -870,7 +856,7 @@
         </w:tc>
         <w:tc>
           <w:tcPr>
-            <w:tcW w:w="2126" w:type="dxa"/>
+            <w:tcW w:w="2840" w:type="dxa"/>
           </w:tcPr>
           <w:p>
             <w:pPr>
@@ -894,7 +880,7 @@
         </w:trPr>
         <w:tc>
           <w:tcPr>
-            <w:tcW w:w="3544" w:type="dxa"/>
+            <w:tcW w:w="3114" w:type="dxa"/>
           </w:tcPr>
           <w:p>
             <w:pPr>
@@ -978,7 +964,7 @@
         </w:tc>
         <w:tc>
           <w:tcPr>
-            <w:tcW w:w="3686" w:type="dxa"/>
+            <w:tcW w:w="3402" w:type="dxa"/>
           </w:tcPr>
           <w:p>
             <w:pPr>
@@ -1191,7 +1177,7 @@
         </w:tc>
         <w:tc>
           <w:tcPr>
-            <w:tcW w:w="2126" w:type="dxa"/>
+            <w:tcW w:w="2840" w:type="dxa"/>
           </w:tcPr>
           <w:p>
             <w:pPr>
@@ -1253,7 +1239,7 @@
         </w:trPr>
         <w:tc>
           <w:tcPr>
-            <w:tcW w:w="3544" w:type="dxa"/>
+            <w:tcW w:w="3114" w:type="dxa"/>
           </w:tcPr>
           <w:p>
             <w:pPr>
@@ -1277,7 +1263,6 @@
                 <w:szCs w:val="24"/>
                 <w:lang w:val="en-US"/>
               </w:rPr>
-              <w:lastRenderedPageBreak/>
               <w:t xml:space="preserve">Follow-up </w:t>
             </w:r>
             <w:proofErr w:type="gramStart"/>
@@ -1339,7 +1324,7 @@
         </w:tc>
         <w:tc>
           <w:tcPr>
-            <w:tcW w:w="3686" w:type="dxa"/>
+            <w:tcW w:w="3402" w:type="dxa"/>
           </w:tcPr>
           <w:p>
             <w:pPr>
@@ -1491,7 +1476,7 @@
         </w:tc>
         <w:tc>
           <w:tcPr>
-            <w:tcW w:w="2126" w:type="dxa"/>
+            <w:tcW w:w="2840" w:type="dxa"/>
           </w:tcPr>
           <w:p>
             <w:pPr>
@@ -1524,8 +1509,8 @@
           <w:b/>
           <w:bCs/>
           <w:color w:val="2F5496" w:themeColor="accent1" w:themeShade="BF"/>
-          <w:sz w:val="28"/>
-          <w:szCs w:val="28"/>
+          <w:sz w:val="24"/>
+          <w:szCs w:val="24"/>
           <w:lang w:val="en-CA"/>
         </w:rPr>
         <w:t>{{#IF_showOpeningComments}}</w:t>
@@ -1583,6 +1568,7 @@
           <w:szCs w:val="24"/>
           <w:lang w:val="en-CA"/>
         </w:rPr>
+        <w:lastRenderedPageBreak/>
         <w:t>{{</w:t>
       </w:r>
       <w:proofErr w:type="spellStart"/>
@@ -1692,6 +1678,17 @@
         </w:rPr>
         <w:t>Inspection Findings</w:t>
       </w:r>
+      <w:r>
+        <w:rPr>
+          <w:rFonts w:ascii="BC Sans" w:hAnsi="BC Sans"/>
+          <w:b/>
+          <w:bCs/>
+          <w:color w:val="2F5496" w:themeColor="accent1" w:themeShade="BF"/>
+          <w:sz w:val="28"/>
+          <w:szCs w:val="28"/>
+        </w:rPr>
+        <w:br/>
+      </w:r>
     </w:p>
     <w:tbl>
       <w:tblPr>
@@ -1716,7 +1713,6 @@
       <w:tr>
         <w:trPr>
           <w:trHeight w:val="300"/>
-          <w:tblHeader/>
         </w:trPr>
         <w:tc>
           <w:tcPr>
@@ -2244,6 +2240,7 @@
                 <w:tag w:val="goog_rdk_8"/>
                 <w:id w:val="-1837352876"/>
               </w:sdtPr>
+              <w:sdtEndPr/>
               <w:sdtContent/>
             </w:sdt>
             <w:r>
@@ -2670,6 +2667,17 @@
           <w:lang w:val="en-CA"/>
         </w:rPr>
       </w:pPr>
+      <w:r>
+        <w:rPr>
+          <w:rFonts w:ascii="BC Sans" w:hAnsi="BC Sans"/>
+          <w:b/>
+          <w:bCs/>
+          <w:color w:val="2F5496" w:themeColor="accent1" w:themeShade="BF"/>
+          <w:sz w:val="28"/>
+          <w:szCs w:val="28"/>
+        </w:rPr>
+        <w:br/>
+      </w:r>
       <w:r>
         <w:rPr>
           <w:rFonts w:ascii="BC Sans" w:hAnsi="BC Sans"/>
@@ -2778,6 +2786,17 @@
         </w:rPr>
         <w:t xml:space="preserve"> Required by</w:t>
       </w:r>
+      <w:r>
+        <w:rPr>
+          <w:rFonts w:ascii="BC Sans" w:hAnsi="BC Sans"/>
+          <w:b/>
+          <w:bCs/>
+          <w:color w:val="2F5496" w:themeColor="accent1" w:themeShade="BF"/>
+          <w:sz w:val="28"/>
+          <w:szCs w:val="28"/>
+        </w:rPr>
+        <w:br/>
+      </w:r>
     </w:p>
     <w:tbl>
       <w:tblPr>
@@ -3089,23 +3108,11 @@
           <w:b/>
           <w:bCs/>
           <w:color w:val="2F5496" w:themeColor="accent1" w:themeShade="BF"/>
-          <w:sz w:val="28"/>
-          <w:szCs w:val="28"/>
+          <w:sz w:val="24"/>
+          <w:szCs w:val="24"/>
           <w:lang w:val="en-CA"/>
         </w:rPr>
-        <w:t>{{</w:t>
-      </w:r>
-      <w:r>
-        <w:rPr>
-          <w:rFonts w:ascii="BC Sans" w:eastAsia="BC Sans" w:hAnsi="BC Sans" w:cs="BC Sans"/>
-          <w:b/>
-          <w:bCs/>
-          <w:color w:val="2F5496" w:themeColor="accent1" w:themeShade="BF"/>
-          <w:sz w:val="28"/>
-          <w:szCs w:val="28"/>
-          <w:lang w:val="en-CA"/>
-        </w:rPr>
-        <w:t>/</w:t>
+        <w:t>{{/</w:t>
       </w:r>
       <w:proofErr w:type="spellStart"/>
       <w:r>
@@ -3114,8 +3121,8 @@
           <w:b/>
           <w:bCs/>
           <w:color w:val="2F5496" w:themeColor="accent1" w:themeShade="BF"/>
-          <w:sz w:val="28"/>
-          <w:szCs w:val="28"/>
+          <w:sz w:val="24"/>
+          <w:szCs w:val="24"/>
           <w:lang w:val="en-CA"/>
         </w:rPr>
         <w:t>IF_showActionsRequired</w:t>
@@ -3128,8 +3135,8 @@
           <w:b/>
           <w:bCs/>
           <w:color w:val="2F5496" w:themeColor="accent1" w:themeShade="BF"/>
-          <w:sz w:val="28"/>
-          <w:szCs w:val="28"/>
+          <w:sz w:val="24"/>
+          <w:szCs w:val="24"/>
           <w:lang w:val="en-CA"/>
         </w:rPr>
         <w:t>}}</w:t>
@@ -3139,8 +3146,8 @@
           <w:rFonts w:ascii="BC Sans" w:hAnsi="BC Sans"/>
           <w:b/>
           <w:bCs/>
-          <w:sz w:val="28"/>
-          <w:szCs w:val="28"/>
+          <w:sz w:val="24"/>
+          <w:szCs w:val="24"/>
           <w:lang w:val="en-CA"/>
         </w:rPr>
         <w:t>{</w:t>
@@ -3151,8 +3158,8 @@
           <w:rFonts w:ascii="BC Sans" w:hAnsi="BC Sans"/>
           <w:b/>
           <w:bCs/>
-          <w:sz w:val="28"/>
-          <w:szCs w:val="28"/>
+          <w:sz w:val="24"/>
+          <w:szCs w:val="24"/>
           <w:lang w:val="en-CA"/>
         </w:rPr>
         <w:t>{#IF_showClosingComments}}</w:t>
@@ -3337,6 +3344,7 @@
                 <w:tag w:val="goog_rdk_15"/>
                 <w:id w:val="14192691"/>
               </w:sdtPr>
+              <w:sdtEndPr/>
               <w:sdtContent/>
             </w:sdt>
             <w:r>
@@ -3349,6 +3357,28 @@
               </w:rPr>
               <w:t>Environmental Health Officer:</w:t>
             </w:r>
+          </w:p>
+          <w:p>
+            <w:pPr>
+              <w:rPr>
+                <w:rFonts w:ascii="BC Sans" w:eastAsia="BC Sans" w:hAnsi="BC Sans" w:cs="BC Sans"/>
+                <w:b/>
+                <w:bCs/>
+                <w:sz w:val="24"/>
+                <w:szCs w:val="24"/>
+              </w:rPr>
+            </w:pPr>
+          </w:p>
+          <w:p>
+            <w:pPr>
+              <w:rPr>
+                <w:rFonts w:ascii="BC Sans" w:eastAsia="BC Sans" w:hAnsi="BC Sans" w:cs="BC Sans"/>
+                <w:b/>
+                <w:bCs/>
+                <w:sz w:val="24"/>
+                <w:szCs w:val="24"/>
+              </w:rPr>
+            </w:pPr>
           </w:p>
           <w:p>
             <w:pPr>
@@ -3365,6 +3395,12 @@
           <w:p>
             <w:pPr>
               <w:spacing w:before="60"/>
+              <w:rPr>
+                <w:rFonts w:ascii="BC Sans" w:eastAsia="BC Sans" w:hAnsi="BC Sans" w:cs="BC Sans"/>
+                <w:sz w:val="24"/>
+                <w:szCs w:val="24"/>
+                <w:lang w:val="en-US"/>
+              </w:rPr>
             </w:pPr>
             <w:r>
               <w:rPr>
@@ -3410,7 +3446,253 @@
                 <w:szCs w:val="24"/>
                 <w:lang w:val="en-US"/>
               </w:rPr>
-              <w:t xml:space="preserve">} </w:t>
+              <w:t>}</w:t>
+            </w:r>
+          </w:p>
+          <w:p>
+            <w:pPr>
+              <w:spacing w:before="60"/>
+              <w:rPr>
+                <w:rFonts w:ascii="BC Sans" w:eastAsia="BC Sans" w:hAnsi="BC Sans" w:cs="BC Sans"/>
+                <w:sz w:val="24"/>
+                <w:szCs w:val="24"/>
+                <w:lang w:val="en-US"/>
+              </w:rPr>
+            </w:pPr>
+          </w:p>
+          <w:p>
+            <w:pPr>
+              <w:spacing w:before="60"/>
+              <w:rPr>
+                <w:rFonts w:ascii="BC Sans" w:eastAsia="BC Sans" w:hAnsi="BC Sans" w:cs="BC Sans"/>
+                <w:sz w:val="24"/>
+                <w:szCs w:val="24"/>
+                <w:lang w:val="en-US"/>
+              </w:rPr>
+            </w:pPr>
+          </w:p>
+          <w:p>
+            <w:pPr>
+              <w:spacing w:before="60"/>
+            </w:pPr>
+          </w:p>
+          <w:p>
+            <w:pPr>
+              <w:spacing w:before="60"/>
+              <w:rPr>
+                <w:rFonts w:ascii="BC Sans" w:eastAsia="BC Sans" w:hAnsi="BC Sans" w:cs="BC Sans"/>
+                <w:sz w:val="24"/>
+                <w:szCs w:val="24"/>
+                <w:lang w:val="en-US"/>
+              </w:rPr>
+            </w:pPr>
+            <w:r>
+              <w:rPr>
+                <w:rFonts w:ascii="BC Sans" w:eastAsia="BC Sans" w:hAnsi="BC Sans" w:cs="BC Sans"/>
+                <w:sz w:val="24"/>
+                <w:szCs w:val="24"/>
+                <w:lang w:val="en-US"/>
+              </w:rPr>
+              <w:br/>
+            </w:r>
+            <w:r>
+              <w:rPr>
+                <w:rFonts w:ascii="BC Sans" w:eastAsia="BC Sans" w:hAnsi="BC Sans" w:cs="BC Sans"/>
+                <w:b/>
+                <w:bCs/>
+                <w:sz w:val="24"/>
+                <w:szCs w:val="24"/>
+                <w:lang w:val="en-US"/>
+              </w:rPr>
+              <w:t xml:space="preserve">Signature </w:t>
+            </w:r>
+            <w:proofErr w:type="gramStart"/>
+            <w:r>
+              <w:rPr>
+                <w:rFonts w:ascii="BC Sans" w:eastAsia="BC Sans" w:hAnsi="BC Sans" w:cs="BC Sans"/>
+                <w:b/>
+                <w:bCs/>
+                <w:sz w:val="24"/>
+                <w:szCs w:val="24"/>
+                <w:lang w:val="en-US"/>
+              </w:rPr>
+              <w:t xml:space="preserve">Refusal: </w:t>
+            </w:r>
+            <w:r>
+              <w:rPr>
+                <w:rFonts w:ascii="BC Sans" w:eastAsia="BC Sans" w:hAnsi="BC Sans" w:cs="BC Sans"/>
+                <w:sz w:val="24"/>
+                <w:szCs w:val="24"/>
+                <w:lang w:val="en-US"/>
+              </w:rPr>
+              <w:t>{</w:t>
+            </w:r>
+            <w:r>
+              <w:rPr>
+                <w:rFonts w:ascii="BC Sans" w:eastAsia="BC Sans" w:hAnsi="BC Sans" w:cs="BC Sans"/>
+                <w:sz w:val="24"/>
+                <w:szCs w:val="24"/>
+                <w:lang w:val="en-US"/>
+              </w:rPr>
+              <w:t>{</w:t>
+            </w:r>
+            <w:proofErr w:type="spellStart"/>
+            <w:proofErr w:type="gramEnd"/>
+            <w:r>
+              <w:rPr>
+                <w:rFonts w:ascii="BC Sans" w:eastAsia="BC Sans" w:hAnsi="BC Sans" w:cs="BC Sans"/>
+                <w:sz w:val="24"/>
+                <w:szCs w:val="24"/>
+              </w:rPr>
+              <w:t>signatureRefusal</w:t>
+            </w:r>
+            <w:proofErr w:type="spellEnd"/>
+            <w:r>
+              <w:rPr>
+                <w:rFonts w:ascii="BC Sans" w:eastAsia="BC Sans" w:hAnsi="BC Sans" w:cs="BC Sans"/>
+                <w:sz w:val="24"/>
+                <w:szCs w:val="24"/>
+                <w:lang w:val="en-US"/>
+              </w:rPr>
+              <w:t>}}</w:t>
+            </w:r>
+          </w:p>
+          <w:p>
+            <w:pPr>
+              <w:spacing w:before="60"/>
+              <w:rPr>
+                <w:rFonts w:ascii="BC Sans" w:eastAsia="BC Sans" w:hAnsi="BC Sans" w:cs="BC Sans"/>
+                <w:sz w:val="24"/>
+                <w:szCs w:val="24"/>
+                <w:lang w:val="en-US"/>
+              </w:rPr>
+            </w:pPr>
+          </w:p>
+          <w:p>
+            <w:pPr>
+              <w:spacing w:before="120"/>
+              <w:rPr>
+                <w:rFonts w:ascii="BC Sans" w:eastAsia="BC Sans" w:hAnsi="BC Sans" w:cs="BC Sans"/>
+                <w:b/>
+                <w:bCs/>
+                <w:sz w:val="24"/>
+                <w:szCs w:val="24"/>
+                <w:lang w:val="en-CA"/>
+              </w:rPr>
+            </w:pPr>
+            <w:r>
+              <w:rPr>
+                <w:rFonts w:ascii="BC Sans" w:eastAsia="BC Sans" w:hAnsi="BC Sans" w:cs="BC Sans"/>
+                <w:b/>
+                <w:bCs/>
+                <w:sz w:val="24"/>
+                <w:szCs w:val="24"/>
+                <w:lang w:val="en-CA"/>
+              </w:rPr>
+              <w:t>{{#IF_showDeliveryMethod</w:t>
+            </w:r>
+            <w:proofErr w:type="gramStart"/>
+            <w:r>
+              <w:rPr>
+                <w:rFonts w:ascii="BC Sans" w:eastAsia="BC Sans" w:hAnsi="BC Sans" w:cs="BC Sans"/>
+                <w:b/>
+                <w:bCs/>
+                <w:sz w:val="24"/>
+                <w:szCs w:val="24"/>
+                <w:lang w:val="en-CA"/>
+              </w:rPr>
+              <w:t>}}</w:t>
+            </w:r>
+            <w:r>
+              <w:rPr>
+                <w:rFonts w:ascii="BC Sans" w:eastAsia="BC Sans" w:hAnsi="BC Sans" w:cs="BC Sans"/>
+                <w:b/>
+                <w:bCs/>
+                <w:sz w:val="24"/>
+                <w:szCs w:val="24"/>
+                <w:lang w:val="en-US"/>
+              </w:rPr>
+              <w:t>Intended</w:t>
+            </w:r>
+            <w:proofErr w:type="gramEnd"/>
+            <w:r>
+              <w:rPr>
+                <w:rFonts w:ascii="BC Sans" w:eastAsia="BC Sans" w:hAnsi="BC Sans" w:cs="BC Sans"/>
+                <w:b/>
+                <w:bCs/>
+                <w:sz w:val="24"/>
+                <w:szCs w:val="24"/>
+                <w:lang w:val="en-US"/>
+              </w:rPr>
+              <w:t xml:space="preserve"> Delivery Method: </w:t>
+            </w:r>
+            <w:r>
+              <w:rPr>
+                <w:rFonts w:ascii="BC Sans" w:eastAsia="BC Sans" w:hAnsi="BC Sans" w:cs="BC Sans"/>
+                <w:sz w:val="24"/>
+                <w:szCs w:val="24"/>
+                <w:lang w:val="en-CA"/>
+              </w:rPr>
+              <w:t>{{</w:t>
+            </w:r>
+            <w:proofErr w:type="spellStart"/>
+            <w:r>
+              <w:rPr>
+                <w:rFonts w:ascii="BC Sans" w:eastAsia="BC Sans" w:hAnsi="BC Sans" w:cs="BC Sans"/>
+                <w:sz w:val="24"/>
+                <w:szCs w:val="24"/>
+                <w:lang w:val="en-CA"/>
+              </w:rPr>
+              <w:t>deliveryMethod</w:t>
+            </w:r>
+            <w:proofErr w:type="spellEnd"/>
+            <w:r>
+              <w:rPr>
+                <w:rFonts w:ascii="BC Sans" w:eastAsia="BC Sans" w:hAnsi="BC Sans" w:cs="BC Sans"/>
+                <w:sz w:val="24"/>
+                <w:szCs w:val="24"/>
+                <w:lang w:val="en-CA"/>
+              </w:rPr>
+              <w:t>}}</w:t>
+            </w:r>
+            <w:r>
+              <w:rPr>
+                <w:rFonts w:ascii="Courier New" w:eastAsia="Times New Roman" w:hAnsi="Courier New" w:cs="Courier New"/>
+                <w:color w:val="D7BA7D"/>
+                <w:sz w:val="18"/>
+                <w:szCs w:val="18"/>
+                <w:lang w:val="en-CA" w:eastAsia="en-CA"/>
+              </w:rPr>
+              <w:t xml:space="preserve"> </w:t>
+            </w:r>
+            <w:r>
+              <w:rPr>
+                <w:rFonts w:ascii="BC Sans" w:eastAsia="BC Sans" w:hAnsi="BC Sans" w:cs="BC Sans"/>
+                <w:sz w:val="24"/>
+                <w:szCs w:val="24"/>
+                <w:lang w:val="en-CA"/>
+              </w:rPr>
+              <w:t>{{/</w:t>
+            </w:r>
+            <w:proofErr w:type="spellStart"/>
+            <w:r>
+              <w:rPr>
+                <w:rFonts w:ascii="BC Sans" w:eastAsia="BC Sans" w:hAnsi="BC Sans" w:cs="BC Sans"/>
+                <w:sz w:val="24"/>
+                <w:szCs w:val="24"/>
+                <w:lang w:val="en-CA"/>
+              </w:rPr>
+              <w:t>IF_showDeliveryMethod</w:t>
+            </w:r>
+            <w:proofErr w:type="spellEnd"/>
+            <w:r>
+              <w:rPr>
+                <w:rFonts w:ascii="BC Sans" w:eastAsia="BC Sans" w:hAnsi="BC Sans" w:cs="BC Sans"/>
+                <w:sz w:val="24"/>
+                <w:szCs w:val="24"/>
+                <w:lang w:val="en-CA"/>
+              </w:rPr>
+              <w:t>}}</w:t>
             </w:r>
           </w:p>
           <w:p>
@@ -3439,67 +3721,6 @@
           <w:lang w:val="en-US"/>
         </w:rPr>
       </w:pPr>
-      <w:r>
-        <w:rPr>
-          <w:rFonts w:ascii="BC Sans" w:eastAsia="BC Sans" w:hAnsi="BC Sans" w:cs="BC Sans"/>
-          <w:b/>
-          <w:bCs/>
-          <w:sz w:val="24"/>
-          <w:szCs w:val="24"/>
-          <w:lang w:val="en-US"/>
-        </w:rPr>
-        <w:t xml:space="preserve">Signature </w:t>
-      </w:r>
-      <w:proofErr w:type="gramStart"/>
-      <w:r>
-        <w:rPr>
-          <w:rFonts w:ascii="BC Sans" w:eastAsia="BC Sans" w:hAnsi="BC Sans" w:cs="BC Sans"/>
-          <w:b/>
-          <w:bCs/>
-          <w:sz w:val="24"/>
-          <w:szCs w:val="24"/>
-          <w:lang w:val="en-US"/>
-        </w:rPr>
-        <w:t xml:space="preserve">Refusal: </w:t>
-      </w:r>
-      <w:r>
-        <w:rPr>
-          <w:rFonts w:ascii="BC Sans" w:eastAsia="BC Sans" w:hAnsi="BC Sans" w:cs="BC Sans"/>
-          <w:sz w:val="24"/>
-          <w:szCs w:val="24"/>
-          <w:lang w:val="en-US"/>
-        </w:rPr>
-        <w:t>{</w:t>
-      </w:r>
-      <w:r>
-        <w:rPr>
-          <w:rFonts w:ascii="BC Sans" w:eastAsia="BC Sans" w:hAnsi="BC Sans" w:cs="BC Sans"/>
-          <w:sz w:val="24"/>
-          <w:szCs w:val="24"/>
-          <w:lang w:val="en-US"/>
-        </w:rPr>
-        <w:t>{</w:t>
-      </w:r>
-      <w:proofErr w:type="spellStart"/>
-      <w:proofErr w:type="gramEnd"/>
-      <w:r>
-        <w:rPr>
-          <w:rFonts w:ascii="BC Sans" w:eastAsia="BC Sans" w:hAnsi="BC Sans" w:cs="BC Sans"/>
-          <w:sz w:val="24"/>
-          <w:szCs w:val="24"/>
-        </w:rPr>
-        <w:t>signatureRefusal</w:t>
-      </w:r>
-      <w:proofErr w:type="spellEnd"/>
-      <w:r>
-        <w:rPr>
-          <w:rFonts w:ascii="BC Sans" w:eastAsia="BC Sans" w:hAnsi="BC Sans" w:cs="BC Sans"/>
-          <w:sz w:val="24"/>
-          <w:szCs w:val="24"/>
-          <w:lang w:val="en-US"/>
-        </w:rPr>
-        <w:t>}}</w:t>
-      </w:r>
     </w:p>
     <w:p>
       <w:pPr>
@@ -3513,141 +3734,11 @@
         </w:rPr>
       </w:pPr>
     </w:p>
-    <w:p>
-      <w:pPr>
-        <w:spacing w:before="120"/>
-        <w:rPr>
-          <w:rFonts w:ascii="BC Sans" w:eastAsia="BC Sans" w:hAnsi="BC Sans" w:cs="BC Sans"/>
-          <w:b/>
-          <w:bCs/>
-          <w:sz w:val="24"/>
-          <w:szCs w:val="24"/>
-          <w:lang w:val="en-CA"/>
-        </w:rPr>
-      </w:pPr>
-      <w:r>
-        <w:rPr>
-          <w:rFonts w:ascii="BC Sans" w:eastAsia="BC Sans" w:hAnsi="BC Sans" w:cs="BC Sans"/>
-          <w:b/>
-          <w:bCs/>
-          <w:sz w:val="24"/>
-          <w:szCs w:val="24"/>
-          <w:lang w:val="en-CA"/>
-        </w:rPr>
-        <w:t>{{#IF_showDeliveryMethod</w:t>
-      </w:r>
-      <w:proofErr w:type="gramStart"/>
-      <w:r>
-        <w:rPr>
-          <w:rFonts w:ascii="BC Sans" w:eastAsia="BC Sans" w:hAnsi="BC Sans" w:cs="BC Sans"/>
-          <w:b/>
-          <w:bCs/>
-          <w:sz w:val="24"/>
-          <w:szCs w:val="24"/>
-          <w:lang w:val="en-CA"/>
-        </w:rPr>
-        <w:t>}}</w:t>
-      </w:r>
-      <w:r>
-        <w:rPr>
-          <w:rFonts w:ascii="BC Sans" w:eastAsia="BC Sans" w:hAnsi="BC Sans" w:cs="BC Sans"/>
-          <w:b/>
-          <w:bCs/>
-          <w:sz w:val="24"/>
-          <w:szCs w:val="24"/>
-          <w:lang w:val="en-US"/>
-        </w:rPr>
-        <w:t>Intended</w:t>
-      </w:r>
-      <w:proofErr w:type="gramEnd"/>
-      <w:r>
-        <w:rPr>
-          <w:rFonts w:ascii="BC Sans" w:eastAsia="BC Sans" w:hAnsi="BC Sans" w:cs="BC Sans"/>
-          <w:b/>
-          <w:bCs/>
-          <w:sz w:val="24"/>
-          <w:szCs w:val="24"/>
-          <w:lang w:val="en-US"/>
-        </w:rPr>
-        <w:t xml:space="preserve"> Delivery Method: </w:t>
-      </w:r>
-      <w:r>
-        <w:rPr>
-          <w:rFonts w:ascii="BC Sans" w:eastAsia="BC Sans" w:hAnsi="BC Sans" w:cs="BC Sans"/>
-          <w:sz w:val="24"/>
-          <w:szCs w:val="24"/>
-          <w:lang w:val="en-CA"/>
-        </w:rPr>
-        <w:t>{{</w:t>
-      </w:r>
-      <w:proofErr w:type="spellStart"/>
-      <w:r>
-        <w:rPr>
-          <w:rFonts w:ascii="BC Sans" w:eastAsia="BC Sans" w:hAnsi="BC Sans" w:cs="BC Sans"/>
-          <w:sz w:val="24"/>
-          <w:szCs w:val="24"/>
-          <w:lang w:val="en-CA"/>
-        </w:rPr>
-        <w:t>deliveryMethod</w:t>
-      </w:r>
-      <w:proofErr w:type="spellEnd"/>
-      <w:r>
-        <w:rPr>
-          <w:rFonts w:ascii="BC Sans" w:eastAsia="BC Sans" w:hAnsi="BC Sans" w:cs="BC Sans"/>
-          <w:sz w:val="24"/>
-          <w:szCs w:val="24"/>
-          <w:lang w:val="en-CA"/>
-        </w:rPr>
-        <w:t>}}</w:t>
-      </w:r>
-      <w:r>
-        <w:rPr>
-          <w:rFonts w:ascii="Courier New" w:eastAsia="Times New Roman" w:hAnsi="Courier New" w:cs="Courier New"/>
-          <w:color w:val="D7BA7D"/>
-          <w:sz w:val="18"/>
-          <w:szCs w:val="18"/>
-          <w:lang w:val="en-CA" w:eastAsia="en-CA"/>
-        </w:rPr>
-        <w:t xml:space="preserve"> </w:t>
-      </w:r>
-      <w:r>
-        <w:rPr>
-          <w:rFonts w:ascii="BC Sans" w:eastAsia="BC Sans" w:hAnsi="BC Sans" w:cs="BC Sans"/>
-          <w:sz w:val="24"/>
-          <w:szCs w:val="24"/>
-          <w:lang w:val="en-CA"/>
-        </w:rPr>
-        <w:t>{{/</w:t>
-      </w:r>
-      <w:proofErr w:type="spellStart"/>
-      <w:r>
-        <w:rPr>
-          <w:rFonts w:ascii="BC Sans" w:eastAsia="BC Sans" w:hAnsi="BC Sans" w:cs="BC Sans"/>
-          <w:sz w:val="24"/>
-          <w:szCs w:val="24"/>
-          <w:lang w:val="en-CA"/>
-        </w:rPr>
-        <w:t>IF_showDeliveryMethod</w:t>
-      </w:r>
-      <w:proofErr w:type="spellEnd"/>
-      <w:r>
-        <w:rPr>
-          <w:rFonts w:ascii="BC Sans" w:eastAsia="BC Sans" w:hAnsi="BC Sans" w:cs="BC Sans"/>
-          <w:sz w:val="24"/>
-          <w:szCs w:val="24"/>
-          <w:lang w:val="en-CA"/>
-        </w:rPr>
-        <w:t>}}</w:t>
-      </w:r>
-    </w:p>
     <w:p/>
     <w:sectPr>
-      <w:headerReference w:type="even" r:id="rId7"/>
-      <w:headerReference w:type="default" r:id="rId8"/>
-      <w:footerReference w:type="even" r:id="rId9"/>
-      <w:footerReference w:type="default" r:id="rId10"/>
-      <w:headerReference w:type="first" r:id="rId11"/>
-      <w:footerReference w:type="first" r:id="rId12"/>
+      <w:footerReference w:type="default" r:id="rId7"/>
+      <w:headerReference w:type="first" r:id="rId8"/>
+      <w:footerReference w:type="first" r:id="rId9"/>
       <w:pgSz w:w="12240" w:h="15840"/>
       <w:pgMar w:top="1440" w:right="1440" w:bottom="1440" w:left="1440" w:header="708" w:footer="708" w:gutter="0"/>
       <w:cols w:space="708"/>
@@ -3679,16 +3770,6 @@
 
 <file path=word/footer1.xml><?xml version="1.0" encoding="utf-8"?>
 <w:ftr xmlns:wpc="http://schemas.microsoft.com/office/word/2010/wordprocessingCanvas" xmlns:cx="http://schemas.microsoft.com/office/drawing/2014/chartex" xmlns:cx1="http://schemas.microsoft.com/office/drawing/2015/9/8/chartex" xmlns:cx2="http://schemas.microsoft.com/office/drawing/2015/10/21/chartex" xmlns:cx3="http://schemas.microsoft.com/office/drawing/2016/5/9/chartex" xmlns:cx4="http://schemas.microsoft.com/office/drawing/2016/5/10/chartex" xmlns:cx5="http://schemas.microsoft.com/office/drawing/2016/5/11/chartex" xmlns:cx6="http://schemas.microsoft.com/office/drawing/2016/5/12/chartex" xmlns:cx7="http://schemas.microsoft.com/office/drawing/2016/5/13/chartex" xmlns:cx8="http://schemas.microsoft.com/office/drawing/2016/5/14/chartex" xmlns:mc="http://schemas.openxmlformats.org/markup-compatibility/2006" xmlns:aink="http://schemas.microsoft.com/office/drawing/2016/ink" xmlns:am3d="http://schemas.microsoft.com/office/drawing/2017/model3d" xmlns:o="urn:schemas-microsoft-com:office:office" xmlns:oel="http://schemas.microsoft.com/office/2019/extlst" xmlns:r="http://schemas.openxmlformats.org/officeDocument/2006/relationships" xmlns:m="http://schemas.openxmlformats.org/officeDocument/2006/math" xmlns:v="urn:schemas-microsoft-com:vml" xmlns:wp14="http://schemas.microsoft.com/office/word/2010/wordprocessingDrawing" xmlns:wp="http://schemas.openxmlformats.org/drawingml/2006/wordprocessingDrawing" xmlns:w10="urn:schemas-microsoft-com:office:word" xmlns:w="http://schemas.openxmlformats.org/wordprocessingml/2006/main" xmlns:w14="http://schemas.microsoft.com/office/word/2010/wordml" xmlns:w15="http://schemas.microsoft.com/office/word/2012/wordml" xmlns:w16cei="http://schemas.microsoft.com/office/word/2026/wordml/cei" xmlns:w16cex="http://schemas.microsoft.com/office/word/2018/wordml/cex" xmlns:w16cid="http://schemas.microsoft.com/office/word/2016/wordml/cid" xmlns:w16="http://schemas.microsoft.com/office/word/2018/wordml" xmlns:w16du="http://schemas.microsoft.com/office/word/2023/wordml/word16du" xmlns:w16sdtdh="http://schemas.microsoft.com/office/word/2020/wordml/sdtdatahash" xmlns:w16sdtfl="http://schemas.microsoft.com/office/word/2024/wordml/sdtformatlock" xmlns:w16se="http://schemas.microsoft.com/office/word/2015/wordml/symex" xmlns:wpg="http://schemas.microsoft.com/office/word/2010/wordprocessingGroup" xmlns:wpi="http://schemas.microsoft.com/office/word/2010/wordprocessingInk" xmlns:wne="http://schemas.microsoft.com/office/word/2006/wordml" xmlns:wps="http://schemas.microsoft.com/office/word/2010/wordprocessingShape" mc:Ignorable="w14 w15 w16se w16cid w16 w16cex w16sdtdh w16sdtfl w16du wp14">
-  <w:p>
-    <w:pPr>
-      <w:pStyle w:val="Footer"/>
-    </w:pPr>
-  </w:p>
-</w:ftr>
-</file>
-
-<file path=word/footer2.xml><?xml version="1.0" encoding="utf-8"?>
-<w:ftr xmlns:wpc="http://schemas.microsoft.com/office/word/2010/wordprocessingCanvas" xmlns:cx="http://schemas.microsoft.com/office/drawing/2014/chartex" xmlns:cx1="http://schemas.microsoft.com/office/drawing/2015/9/8/chartex" xmlns:cx2="http://schemas.microsoft.com/office/drawing/2015/10/21/chartex" xmlns:cx3="http://schemas.microsoft.com/office/drawing/2016/5/9/chartex" xmlns:cx4="http://schemas.microsoft.com/office/drawing/2016/5/10/chartex" xmlns:cx5="http://schemas.microsoft.com/office/drawing/2016/5/11/chartex" xmlns:cx6="http://schemas.microsoft.com/office/drawing/2016/5/12/chartex" xmlns:cx7="http://schemas.microsoft.com/office/drawing/2016/5/13/chartex" xmlns:cx8="http://schemas.microsoft.com/office/drawing/2016/5/14/chartex" xmlns:mc="http://schemas.openxmlformats.org/markup-compatibility/2006" xmlns:aink="http://schemas.microsoft.com/office/drawing/2016/ink" xmlns:am3d="http://schemas.microsoft.com/office/drawing/2017/model3d" xmlns:o="urn:schemas-microsoft-com:office:office" xmlns:oel="http://schemas.microsoft.com/office/2019/extlst" xmlns:r="http://schemas.openxmlformats.org/officeDocument/2006/relationships" xmlns:m="http://schemas.openxmlformats.org/officeDocument/2006/math" xmlns:v="urn:schemas-microsoft-com:vml" xmlns:wp14="http://schemas.microsoft.com/office/word/2010/wordprocessingDrawing" xmlns:wp="http://schemas.openxmlformats.org/drawingml/2006/wordprocessingDrawing" xmlns:w10="urn:schemas-microsoft-com:office:word" xmlns:w="http://schemas.openxmlformats.org/wordprocessingml/2006/main" xmlns:w14="http://schemas.microsoft.com/office/word/2010/wordml" xmlns:w15="http://schemas.microsoft.com/office/word/2012/wordml" xmlns:w16cei="http://schemas.microsoft.com/office/word/2026/wordml/cei" xmlns:w16cex="http://schemas.microsoft.com/office/word/2018/wordml/cex" xmlns:w16cid="http://schemas.microsoft.com/office/word/2016/wordml/cid" xmlns:w16="http://schemas.microsoft.com/office/word/2018/wordml" xmlns:w16du="http://schemas.microsoft.com/office/word/2023/wordml/word16du" xmlns:w16sdtdh="http://schemas.microsoft.com/office/word/2020/wordml/sdtdatahash" xmlns:w16sdtfl="http://schemas.microsoft.com/office/word/2024/wordml/sdtformatlock" xmlns:w16se="http://schemas.microsoft.com/office/word/2015/wordml/symex" xmlns:wpg="http://schemas.microsoft.com/office/word/2010/wordprocessingGroup" xmlns:wpi="http://schemas.microsoft.com/office/word/2010/wordprocessingInk" xmlns:wne="http://schemas.microsoft.com/office/word/2006/wordml" xmlns:wps="http://schemas.microsoft.com/office/word/2010/wordprocessingShape" mc:Ignorable="w14 w15 w16se w16cid w16 w16cex w16sdtdh w16sdtfl w16du wp14">
   <w:sdt>
     <w:sdtPr>
       <w:rPr>
@@ -3700,6 +3781,7 @@
         <w:docPartUnique/>
       </w:docPartObj>
     </w:sdtPr>
+    <w:sdtEndPr/>
     <w:sdtContent>
       <w:p>
         <w:pPr>
@@ -3816,7 +3898,7 @@
 </w:ftr>
 </file>
 
-<file path=word/footer3.xml><?xml version="1.0" encoding="utf-8"?>
+<file path=word/footer2.xml><?xml version="1.0" encoding="utf-8"?>
 <w:ftr xmlns:wpc="http://schemas.microsoft.com/office/word/2010/wordprocessingCanvas" xmlns:cx="http://schemas.microsoft.com/office/drawing/2014/chartex" xmlns:cx1="http://schemas.microsoft.com/office/drawing/2015/9/8/chartex" xmlns:cx2="http://schemas.microsoft.com/office/drawing/2015/10/21/chartex" xmlns:cx3="http://schemas.microsoft.com/office/drawing/2016/5/9/chartex" xmlns:cx4="http://schemas.microsoft.com/office/drawing/2016/5/10/chartex" xmlns:cx5="http://schemas.microsoft.com/office/drawing/2016/5/11/chartex" xmlns:cx6="http://schemas.microsoft.com/office/drawing/2016/5/12/chartex" xmlns:cx7="http://schemas.microsoft.com/office/drawing/2016/5/13/chartex" xmlns:cx8="http://schemas.microsoft.com/office/drawing/2016/5/14/chartex" xmlns:mc="http://schemas.openxmlformats.org/markup-compatibility/2006" xmlns:aink="http://schemas.microsoft.com/office/drawing/2016/ink" xmlns:am3d="http://schemas.microsoft.com/office/drawing/2017/model3d" xmlns:o="urn:schemas-microsoft-com:office:office" xmlns:oel="http://schemas.microsoft.com/office/2019/extlst" xmlns:r="http://schemas.openxmlformats.org/officeDocument/2006/relationships" xmlns:m="http://schemas.openxmlformats.org/officeDocument/2006/math" xmlns:v="urn:schemas-microsoft-com:vml" xmlns:wp14="http://schemas.microsoft.com/office/word/2010/wordprocessingDrawing" xmlns:wp="http://schemas.openxmlformats.org/drawingml/2006/wordprocessingDrawing" xmlns:w10="urn:schemas-microsoft-com:office:word" xmlns:w="http://schemas.openxmlformats.org/wordprocessingml/2006/main" xmlns:w14="http://schemas.microsoft.com/office/word/2010/wordml" xmlns:w15="http://schemas.microsoft.com/office/word/2012/wordml" xmlns:w16cei="http://schemas.microsoft.com/office/word/2026/wordml/cei" xmlns:w16cex="http://schemas.microsoft.com/office/word/2018/wordml/cex" xmlns:w16cid="http://schemas.microsoft.com/office/word/2016/wordml/cid" xmlns:w16="http://schemas.microsoft.com/office/word/2018/wordml" xmlns:w16du="http://schemas.microsoft.com/office/word/2023/wordml/word16du" xmlns:w16sdtdh="http://schemas.microsoft.com/office/word/2020/wordml/sdtdatahash" xmlns:w16sdtfl="http://schemas.microsoft.com/office/word/2024/wordml/sdtformatlock" xmlns:w16se="http://schemas.microsoft.com/office/word/2015/wordml/symex" xmlns:wpg="http://schemas.microsoft.com/office/word/2010/wordprocessingGroup" xmlns:wpi="http://schemas.microsoft.com/office/word/2010/wordprocessingInk" xmlns:wne="http://schemas.microsoft.com/office/word/2006/wordml" xmlns:wps="http://schemas.microsoft.com/office/word/2010/wordprocessingShape" mc:Ignorable="w14 w15 w16se w16cid w16 w16cex w16sdtdh w16sdtfl w16du wp14">
   <w:sdt>
     <w:sdtPr>
@@ -3829,6 +3911,7 @@
         <w:docPartUnique/>
       </w:docPartObj>
     </w:sdtPr>
+    <w:sdtEndPr/>
     <w:sdtContent>
       <w:p>
         <w:pPr>
@@ -3965,26 +4048,6 @@
 </file>
 
 <file path=word/header1.xml><?xml version="1.0" encoding="utf-8"?>
-<w:hdr xmlns:wpc="http://schemas.microsoft.com/office/word/2010/wordprocessingCanvas" xmlns:cx="http://schemas.microsoft.com/office/drawing/2014/chartex" xmlns:cx1="http://schemas.microsoft.com/office/drawing/2015/9/8/chartex" xmlns:cx2="http://schemas.microsoft.com/office/drawing/2015/10/21/chartex" xmlns:cx3="http://schemas.microsoft.com/office/drawing/2016/5/9/chartex" xmlns:cx4="http://schemas.microsoft.com/office/drawing/2016/5/10/chartex" xmlns:cx5="http://schemas.microsoft.com/office/drawing/2016/5/11/chartex" xmlns:cx6="http://schemas.microsoft.com/office/drawing/2016/5/12/chartex" xmlns:cx7="http://schemas.microsoft.com/office/drawing/2016/5/13/chartex" xmlns:cx8="http://schemas.microsoft.com/office/drawing/2016/5/14/chartex" xmlns:mc="http://schemas.openxmlformats.org/markup-compatibility/2006" xmlns:aink="http://schemas.microsoft.com/office/drawing/2016/ink" xmlns:am3d="http://schemas.microsoft.com/office/drawing/2017/model3d" xmlns:o="urn:schemas-microsoft-com:office:office" xmlns:oel="http://schemas.microsoft.com/office/2019/extlst" xmlns:r="http://schemas.openxmlformats.org/officeDocument/2006/relationships" xmlns:m="http://schemas.openxmlformats.org/officeDocument/2006/math" xmlns:v="urn:schemas-microsoft-com:vml" xmlns:wp14="http://schemas.microsoft.com/office/word/2010/wordprocessingDrawing" xmlns:wp="http://schemas.openxmlformats.org/drawingml/2006/wordprocessingDrawing" xmlns:w10="urn:schemas-microsoft-com:office:word" xmlns:w="http://schemas.openxmlformats.org/wordprocessingml/2006/main" xmlns:w14="http://schemas.microsoft.com/office/word/2010/wordml" xmlns:w15="http://schemas.microsoft.com/office/word/2012/wordml" xmlns:w16cei="http://schemas.microsoft.com/office/word/2026/wordml/cei" xmlns:w16cex="http://schemas.microsoft.com/office/word/2018/wordml/cex" xmlns:w16cid="http://schemas.microsoft.com/office/word/2016/wordml/cid" xmlns:w16="http://schemas.microsoft.com/office/word/2018/wordml" xmlns:w16du="http://schemas.microsoft.com/office/word/2023/wordml/word16du" xmlns:w16sdtdh="http://schemas.microsoft.com/office/word/2020/wordml/sdtdatahash" xmlns:w16sdtfl="http://schemas.microsoft.com/office/word/2024/wordml/sdtformatlock" xmlns:w16se="http://schemas.microsoft.com/office/word/2015/wordml/symex" xmlns:wpg="http://schemas.microsoft.com/office/word/2010/wordprocessingGroup" xmlns:wpi="http://schemas.microsoft.com/office/word/2010/wordprocessingInk" xmlns:wne="http://schemas.microsoft.com/office/word/2006/wordml" xmlns:wps="http://schemas.microsoft.com/office/word/2010/wordprocessingShape" mc:Ignorable="w14 w15 w16se w16cid w16 w16cex w16sdtdh w16sdtfl w16du wp14">
-  <w:p>
-    <w:pPr>
-      <w:pStyle w:val="Header"/>
-    </w:pPr>
-  </w:p>
-</w:hdr>
-</file>
-
-<file path=word/header2.xml><?xml version="1.0" encoding="utf-8"?>
-<w:hdr xmlns:wpc="http://schemas.microsoft.com/office/word/2010/wordprocessingCanvas" xmlns:cx="http://schemas.microsoft.com/office/drawing/2014/chartex" xmlns:cx1="http://schemas.microsoft.com/office/drawing/2015/9/8/chartex" xmlns:cx2="http://schemas.microsoft.com/office/drawing/2015/10/21/chartex" xmlns:cx3="http://schemas.microsoft.com/office/drawing/2016/5/9/chartex" xmlns:cx4="http://schemas.microsoft.com/office/drawing/2016/5/10/chartex" xmlns:cx5="http://schemas.microsoft.com/office/drawing/2016/5/11/chartex" xmlns:cx6="http://schemas.microsoft.com/office/drawing/2016/5/12/chartex" xmlns:cx7="http://schemas.microsoft.com/office/drawing/2016/5/13/chartex" xmlns:cx8="http://schemas.microsoft.com/office/drawing/2016/5/14/chartex" xmlns:mc="http://schemas.openxmlformats.org/markup-compatibility/2006" xmlns:aink="http://schemas.microsoft.com/office/drawing/2016/ink" xmlns:am3d="http://schemas.microsoft.com/office/drawing/2017/model3d" xmlns:o="urn:schemas-microsoft-com:office:office" xmlns:oel="http://schemas.microsoft.com/office/2019/extlst" xmlns:r="http://schemas.openxmlformats.org/officeDocument/2006/relationships" xmlns:m="http://schemas.openxmlformats.org/officeDocument/2006/math" xmlns:v="urn:schemas-microsoft-com:vml" xmlns:wp14="http://schemas.microsoft.com/office/word/2010/wordprocessingDrawing" xmlns:wp="http://schemas.openxmlformats.org/drawingml/2006/wordprocessingDrawing" xmlns:w10="urn:schemas-microsoft-com:office:word" xmlns:w="http://schemas.openxmlformats.org/wordprocessingml/2006/main" xmlns:w14="http://schemas.microsoft.com/office/word/2010/wordml" xmlns:w15="http://schemas.microsoft.com/office/word/2012/wordml" xmlns:w16cei="http://schemas.microsoft.com/office/word/2026/wordml/cei" xmlns:w16cex="http://schemas.microsoft.com/office/word/2018/wordml/cex" xmlns:w16cid="http://schemas.microsoft.com/office/word/2016/wordml/cid" xmlns:w16="http://schemas.microsoft.com/office/word/2018/wordml" xmlns:w16du="http://schemas.microsoft.com/office/word/2023/wordml/word16du" xmlns:w16sdtdh="http://schemas.microsoft.com/office/word/2020/wordml/sdtdatahash" xmlns:w16sdtfl="http://schemas.microsoft.com/office/word/2024/wordml/sdtformatlock" xmlns:w16se="http://schemas.microsoft.com/office/word/2015/wordml/symex" xmlns:wpg="http://schemas.microsoft.com/office/word/2010/wordprocessingGroup" xmlns:wpi="http://schemas.microsoft.com/office/word/2010/wordprocessingInk" xmlns:wne="http://schemas.microsoft.com/office/word/2006/wordml" xmlns:wps="http://schemas.microsoft.com/office/word/2010/wordprocessingShape" mc:Ignorable="w14 w15 w16se w16cid w16 w16cex w16sdtdh w16sdtfl w16du wp14">
-  <w:p>
-    <w:pPr>
-      <w:pStyle w:val="Header"/>
-    </w:pPr>
-  </w:p>
-</w:hdr>
-</file>
-
-<file path=word/header3.xml><?xml version="1.0" encoding="utf-8"?>
 <w:hdr xmlns:wpc="http://schemas.microsoft.com/office/word/2010/wordprocessingCanvas" xmlns:cx="http://schemas.microsoft.com/office/drawing/2014/chartex" xmlns:cx1="http://schemas.microsoft.com/office/drawing/2015/9/8/chartex" xmlns:cx2="http://schemas.microsoft.com/office/drawing/2015/10/21/chartex" xmlns:cx3="http://schemas.microsoft.com/office/drawing/2016/5/9/chartex" xmlns:cx4="http://schemas.microsoft.com/office/drawing/2016/5/10/chartex" xmlns:cx5="http://schemas.microsoft.com/office/drawing/2016/5/11/chartex" xmlns:cx6="http://schemas.microsoft.com/office/drawing/2016/5/12/chartex" xmlns:cx7="http://schemas.microsoft.com/office/drawing/2016/5/13/chartex" xmlns:cx8="http://schemas.microsoft.com/office/drawing/2016/5/14/chartex" xmlns:mc="http://schemas.openxmlformats.org/markup-compatibility/2006" xmlns:aink="http://schemas.microsoft.com/office/drawing/2016/ink" xmlns:am3d="http://schemas.microsoft.com/office/drawing/2017/model3d" xmlns:o="urn:schemas-microsoft-com:office:office" xmlns:oel="http://schemas.microsoft.com/office/2019/extlst" xmlns:r="http://schemas.openxmlformats.org/officeDocument/2006/relationships" xmlns:m="http://schemas.openxmlformats.org/officeDocument/2006/math" xmlns:v="urn:schemas-microsoft-com:vml" xmlns:wp14="http://schemas.microsoft.com/office/word/2010/wordprocessingDrawing" xmlns:wp="http://schemas.openxmlformats.org/drawingml/2006/wordprocessingDrawing" xmlns:w10="urn:schemas-microsoft-com:office:word" xmlns:w="http://schemas.openxmlformats.org/wordprocessingml/2006/main" xmlns:w14="http://schemas.microsoft.com/office/word/2010/wordml" xmlns:w15="http://schemas.microsoft.com/office/word/2012/wordml" xmlns:w16cei="http://schemas.microsoft.com/office/word/2026/wordml/cei" xmlns:w16cex="http://schemas.microsoft.com/office/word/2018/wordml/cex" xmlns:w16cid="http://schemas.microsoft.com/office/word/2016/wordml/cid" xmlns:w16="http://schemas.microsoft.com/office/word/2018/wordml" xmlns:w16du="http://schemas.microsoft.com/office/word/2023/wordml/word16du" xmlns:w16sdtdh="http://schemas.microsoft.com/office/word/2020/wordml/sdtdatahash" xmlns:w16sdtfl="http://schemas.microsoft.com/office/word/2024/wordml/sdtformatlock" xmlns:w16se="http://schemas.microsoft.com/office/word/2015/wordml/symex" xmlns:wpg="http://schemas.microsoft.com/office/word/2010/wordprocessingGroup" xmlns:wpi="http://schemas.microsoft.com/office/word/2010/wordprocessingInk" xmlns:wne="http://schemas.microsoft.com/office/word/2006/wordml" xmlns:wps="http://schemas.microsoft.com/office/word/2010/wordprocessingShape" mc:Ignorable="w14 w15 w16se w16cid w16 w16cex w16sdtdh w16sdtfl w16du wp14">
   <w:tbl>
     <w:tblPr>
@@ -4608,40 +4671,6 @@
         <w:p>
           <w:pPr>
             <w:pStyle w:val="Header"/>
-          </w:pPr>
-        </w:p>
-      </w:tc>
-    </w:tr>
-    <w:tr>
-      <w:tc>
-        <w:tcPr>
-          <w:tcW w:w="4675" w:type="dxa"/>
-        </w:tcPr>
-        <w:p>
-          <w:pPr>
-            <w:jc w:val="both"/>
-            <w:rPr>
-              <w:kern w:val="2"/>
-              <w:sz w:val="14"/>
-              <w:szCs w:val="14"/>
-              <w:lang w:val="en-CA" w:eastAsia="en-CA"/>
-              <w14:ligatures w14:val="standardContextual"/>
-            </w:rPr>
-          </w:pPr>
-        </w:p>
-      </w:tc>
-      <w:tc>
-        <w:tcPr>
-          <w:tcW w:w="4675" w:type="dxa"/>
-        </w:tcPr>
-        <w:p>
-          <w:pPr>
-            <w:pStyle w:val="Header"/>
-            <w:rPr>
-              <w:rFonts w:ascii="BC Sans" w:hAnsi="BC Sans"/>
-              <w:sz w:val="24"/>
-              <w:szCs w:val="24"/>
-            </w:rPr>
           </w:pPr>
         </w:p>
       </w:tc>

</xml_diff>